<commit_message>
Initial Git commit for llm_Engineering project
</commit_message>
<xml_diff>
--- a/AI Projects/Python_AI_Study_Plan.docx
+++ b/AI Projects/Python_AI_Study_Plan.docx
@@ -28,7 +28,23 @@
           <w:sz w:val="24"/>
           <w:szCs w:val="24"/>
         </w:rPr>
-        <w:t>12 Weeks  ·  8–15 hrs/week</w:t>
+        <w:t xml:space="preserve">12 </w:t>
+      </w:r>
+      <w:r>
+        <w:rPr>
+          <w:color w:val="555555"/>
+          <w:sz w:val="24"/>
+          <w:szCs w:val="24"/>
+        </w:rPr>
+        <w:t>Weeks · 8</w:t>
+      </w:r>
+      <w:r>
+        <w:rPr>
+          <w:color w:val="555555"/>
+          <w:sz w:val="24"/>
+          <w:szCs w:val="24"/>
+        </w:rPr>
+        <w:t>–15 hrs/week</w:t>
       </w:r>
     </w:p>
     <w:tbl>
@@ -52,12 +68,6 @@
         <w:gridCol w:w="9360"/>
       </w:tblGrid>
       <w:tr>
-        <w:tblPrEx>
-          <w:tblCellMar>
-            <w:top w:w="0" w:type="dxa"/>
-            <w:bottom w:w="0" w:type="dxa"/>
-          </w:tblCellMar>
-        </w:tblPrEx>
         <w:tc>
           <w:tcPr>
             <w:tcW w:w="9360" w:type="dxa"/>
@@ -116,7 +126,27 @@
           <w:sz w:val="28"/>
           <w:szCs w:val="28"/>
         </w:rPr>
-        <w:t>Phase 1 — Python Foundations  (Weeks 1–4)</w:t>
+        <w:t xml:space="preserve">Phase 1 — Python </w:t>
+      </w:r>
+      <w:r>
+        <w:rPr>
+          <w:b/>
+          <w:bCs/>
+          <w:color w:val="1A1A1A"/>
+          <w:sz w:val="28"/>
+          <w:szCs w:val="28"/>
+        </w:rPr>
+        <w:t>Foundations (</w:t>
+      </w:r>
+      <w:r>
+        <w:rPr>
+          <w:b/>
+          <w:bCs/>
+          <w:color w:val="1A1A1A"/>
+          <w:sz w:val="28"/>
+          <w:szCs w:val="28"/>
+        </w:rPr>
+        <w:t>Weeks 1–4)</w:t>
       </w:r>
     </w:p>
     <w:p>
@@ -150,16 +180,10 @@
         <w:tblLook w:val="0000" w:firstRow="0" w:lastRow="0" w:firstColumn="0" w:lastColumn="0" w:noHBand="0" w:noVBand="0"/>
       </w:tblPr>
       <w:tblGrid>
-        <w:gridCol w:w="720"/>
-        <w:gridCol w:w="8640"/>
+        <w:gridCol w:w="740"/>
+        <w:gridCol w:w="8620"/>
       </w:tblGrid>
       <w:tr>
-        <w:tblPrEx>
-          <w:tblCellMar>
-            <w:top w:w="0" w:type="dxa"/>
-            <w:bottom w:w="0" w:type="dxa"/>
-          </w:tblCellMar>
-        </w:tblPrEx>
         <w:tc>
           <w:tcPr>
             <w:tcW w:w="720" w:type="dxa"/>
@@ -181,13 +205,21 @@
           <w:p>
             <w:pPr>
               <w:jc w:val="center"/>
-            </w:pPr>
-            <w:r>
-              <w:rPr>
-                <w:sz w:val="20"/>
-                <w:szCs w:val="20"/>
-              </w:rPr>
-              <w:t>☐</w:t>
+              <w:rPr>
+                <w:b/>
+                <w:bCs/>
+                <w:color w:val="00B050"/>
+              </w:rPr>
+            </w:pPr>
+            <w:r>
+              <w:rPr>
+                <w:b/>
+                <w:bCs/>
+                <w:color w:val="00B050"/>
+                <w:sz w:val="20"/>
+                <w:szCs w:val="20"/>
+              </w:rPr>
+              <w:t>Done</w:t>
             </w:r>
           </w:p>
         </w:tc>
@@ -219,12 +251,6 @@
         </w:tc>
       </w:tr>
       <w:tr>
-        <w:tblPrEx>
-          <w:tblCellMar>
-            <w:top w:w="0" w:type="dxa"/>
-            <w:bottom w:w="0" w:type="dxa"/>
-          </w:tblCellMar>
-        </w:tblPrEx>
         <w:tc>
           <w:tcPr>
             <w:tcW w:w="720" w:type="dxa"/>
@@ -246,13 +272,21 @@
           <w:p>
             <w:pPr>
               <w:jc w:val="center"/>
-            </w:pPr>
-            <w:r>
-              <w:rPr>
-                <w:sz w:val="20"/>
-                <w:szCs w:val="20"/>
-              </w:rPr>
-              <w:t>☐</w:t>
+              <w:rPr>
+                <w:b/>
+                <w:bCs/>
+                <w:color w:val="00B050"/>
+              </w:rPr>
+            </w:pPr>
+            <w:r>
+              <w:rPr>
+                <w:b/>
+                <w:bCs/>
+                <w:color w:val="00B050"/>
+                <w:sz w:val="20"/>
+                <w:szCs w:val="20"/>
+              </w:rPr>
+              <w:t>Done</w:t>
             </w:r>
           </w:p>
         </w:tc>
@@ -299,12 +333,6 @@
         </w:tc>
       </w:tr>
       <w:tr>
-        <w:tblPrEx>
-          <w:tblCellMar>
-            <w:top w:w="0" w:type="dxa"/>
-            <w:bottom w:w="0" w:type="dxa"/>
-          </w:tblCellMar>
-        </w:tblPrEx>
         <w:tc>
           <w:tcPr>
             <w:tcW w:w="720" w:type="dxa"/>
@@ -326,9 +354,17 @@
           <w:p>
             <w:pPr>
               <w:jc w:val="center"/>
-            </w:pPr>
-            <w:r>
-              <w:rPr>
+              <w:rPr>
+                <w:b/>
+                <w:bCs/>
+                <w:color w:val="00B050"/>
+              </w:rPr>
+            </w:pPr>
+            <w:r>
+              <w:rPr>
+                <w:b/>
+                <w:bCs/>
+                <w:color w:val="00B050"/>
                 <w:sz w:val="20"/>
                 <w:szCs w:val="20"/>
               </w:rPr>
@@ -400,16 +436,10 @@
         <w:tblLook w:val="0000" w:firstRow="0" w:lastRow="0" w:firstColumn="0" w:lastColumn="0" w:noHBand="0" w:noVBand="0"/>
       </w:tblPr>
       <w:tblGrid>
-        <w:gridCol w:w="720"/>
-        <w:gridCol w:w="8640"/>
+        <w:gridCol w:w="740"/>
+        <w:gridCol w:w="8620"/>
       </w:tblGrid>
       <w:tr>
-        <w:tblPrEx>
-          <w:tblCellMar>
-            <w:top w:w="0" w:type="dxa"/>
-            <w:bottom w:w="0" w:type="dxa"/>
-          </w:tblCellMar>
-        </w:tblPrEx>
         <w:tc>
           <w:tcPr>
             <w:tcW w:w="720" w:type="dxa"/>
@@ -434,10 +464,13 @@
             </w:pPr>
             <w:r>
               <w:rPr>
-                <w:sz w:val="20"/>
-                <w:szCs w:val="20"/>
-              </w:rPr>
-              <w:t>☐</w:t>
+                <w:b/>
+                <w:bCs/>
+                <w:color w:val="00B050"/>
+                <w:sz w:val="20"/>
+                <w:szCs w:val="20"/>
+              </w:rPr>
+              <w:t>Done</w:t>
             </w:r>
           </w:p>
         </w:tc>
@@ -469,12 +502,6 @@
         </w:tc>
       </w:tr>
       <w:tr>
-        <w:tblPrEx>
-          <w:tblCellMar>
-            <w:top w:w="0" w:type="dxa"/>
-            <w:bottom w:w="0" w:type="dxa"/>
-          </w:tblCellMar>
-        </w:tblPrEx>
         <w:tc>
           <w:tcPr>
             <w:tcW w:w="720" w:type="dxa"/>
@@ -549,12 +576,6 @@
         </w:tc>
       </w:tr>
       <w:tr>
-        <w:tblPrEx>
-          <w:tblCellMar>
-            <w:top w:w="0" w:type="dxa"/>
-            <w:bottom w:w="0" w:type="dxa"/>
-          </w:tblCellMar>
-        </w:tblPrEx>
         <w:tc>
           <w:tcPr>
             <w:tcW w:w="720" w:type="dxa"/>
@@ -608,7 +629,23 @@
                 <w:sz w:val="20"/>
                 <w:szCs w:val="20"/>
               </w:rPr>
-              <w:t>Practice: FizzBuzz, simple number games, function challenges</w:t>
+              <w:t xml:space="preserve">Practice: </w:t>
+            </w:r>
+            <w:proofErr w:type="spellStart"/>
+            <w:r>
+              <w:rPr>
+                <w:sz w:val="20"/>
+                <w:szCs w:val="20"/>
+              </w:rPr>
+              <w:t>FizzBuzz</w:t>
+            </w:r>
+            <w:proofErr w:type="spellEnd"/>
+            <w:r>
+              <w:rPr>
+                <w:sz w:val="20"/>
+                <w:szCs w:val="20"/>
+              </w:rPr>
+              <w:t>, simple number games, function challenges</w:t>
             </w:r>
           </w:p>
         </w:tc>
@@ -654,12 +691,6 @@
         <w:gridCol w:w="8640"/>
       </w:tblGrid>
       <w:tr>
-        <w:tblPrEx>
-          <w:tblCellMar>
-            <w:top w:w="0" w:type="dxa"/>
-            <w:bottom w:w="0" w:type="dxa"/>
-          </w:tblCellMar>
-        </w:tblPrEx>
         <w:tc>
           <w:tcPr>
             <w:tcW w:w="720" w:type="dxa"/>
@@ -713,18 +744,28 @@
                 <w:sz w:val="20"/>
                 <w:szCs w:val="20"/>
               </w:rPr>
-              <w:t>Data structures: lists, dicts, sets, tuples</w:t>
+              <w:t xml:space="preserve">Data structures: lists, </w:t>
+            </w:r>
+            <w:proofErr w:type="spellStart"/>
+            <w:r>
+              <w:rPr>
+                <w:sz w:val="20"/>
+                <w:szCs w:val="20"/>
+              </w:rPr>
+              <w:t>dicts</w:t>
+            </w:r>
+            <w:proofErr w:type="spellEnd"/>
+            <w:r>
+              <w:rPr>
+                <w:sz w:val="20"/>
+                <w:szCs w:val="20"/>
+              </w:rPr>
+              <w:t>, sets, tuples</w:t>
             </w:r>
           </w:p>
         </w:tc>
       </w:tr>
       <w:tr>
-        <w:tblPrEx>
-          <w:tblCellMar>
-            <w:top w:w="0" w:type="dxa"/>
-            <w:bottom w:w="0" w:type="dxa"/>
-          </w:tblCellMar>
-        </w:tblPrEx>
         <w:tc>
           <w:tcPr>
             <w:tcW w:w="720" w:type="dxa"/>
@@ -799,12 +840,6 @@
         </w:tc>
       </w:tr>
       <w:tr>
-        <w:tblPrEx>
-          <w:tblCellMar>
-            <w:top w:w="0" w:type="dxa"/>
-            <w:bottom w:w="0" w:type="dxa"/>
-          </w:tblCellMar>
-        </w:tblPrEx>
         <w:tc>
           <w:tcPr>
             <w:tcW w:w="720" w:type="dxa"/>
@@ -904,12 +939,6 @@
         <w:gridCol w:w="8640"/>
       </w:tblGrid>
       <w:tr>
-        <w:tblPrEx>
-          <w:tblCellMar>
-            <w:top w:w="0" w:type="dxa"/>
-            <w:bottom w:w="0" w:type="dxa"/>
-          </w:tblCellMar>
-        </w:tblPrEx>
         <w:tc>
           <w:tcPr>
             <w:tcW w:w="720" w:type="dxa"/>
@@ -969,12 +998,6 @@
         </w:tc>
       </w:tr>
       <w:tr>
-        <w:tblPrEx>
-          <w:tblCellMar>
-            <w:top w:w="0" w:type="dxa"/>
-            <w:bottom w:w="0" w:type="dxa"/>
-          </w:tblCellMar>
-        </w:tblPrEx>
         <w:tc>
           <w:tcPr>
             <w:tcW w:w="720" w:type="dxa"/>
@@ -1034,12 +1057,6 @@
         </w:tc>
       </w:tr>
       <w:tr>
-        <w:tblPrEx>
-          <w:tblCellMar>
-            <w:top w:w="0" w:type="dxa"/>
-            <w:bottom w:w="0" w:type="dxa"/>
-          </w:tblCellMar>
-        </w:tblPrEx>
         <w:tc>
           <w:tcPr>
             <w:tcW w:w="720" w:type="dxa"/>
@@ -1119,7 +1136,29 @@
           <w:sz w:val="28"/>
           <w:szCs w:val="28"/>
         </w:rPr>
-        <w:t>Phase 2 — Python for Data &amp; ML  (Weeks 5–8)</w:t>
+        <w:t xml:space="preserve">Phase 2 — Python for Data &amp; </w:t>
+      </w:r>
+      <w:proofErr w:type="gramStart"/>
+      <w:r>
+        <w:rPr>
+          <w:b/>
+          <w:bCs/>
+          <w:color w:val="1A1A1A"/>
+          <w:sz w:val="28"/>
+          <w:szCs w:val="28"/>
+        </w:rPr>
+        <w:t>ML  (</w:t>
+      </w:r>
+      <w:proofErr w:type="gramEnd"/>
+      <w:r>
+        <w:rPr>
+          <w:b/>
+          <w:bCs/>
+          <w:color w:val="1A1A1A"/>
+          <w:sz w:val="28"/>
+          <w:szCs w:val="28"/>
+        </w:rPr>
+        <w:t>Weeks 5–8)</w:t>
       </w:r>
     </w:p>
     <w:p>
@@ -1157,12 +1196,6 @@
         <w:gridCol w:w="8640"/>
       </w:tblGrid>
       <w:tr>
-        <w:tblPrEx>
-          <w:tblCellMar>
-            <w:top w:w="0" w:type="dxa"/>
-            <w:bottom w:w="0" w:type="dxa"/>
-          </w:tblCellMar>
-        </w:tblPrEx>
         <w:tc>
           <w:tcPr>
             <w:tcW w:w="720" w:type="dxa"/>
@@ -1231,19 +1264,12 @@
                 <w:sz w:val="18"/>
                 <w:szCs w:val="18"/>
               </w:rPr>
-              <w:lastRenderedPageBreak/>
               <w:t>Resource: NumPy docs</w:t>
             </w:r>
           </w:p>
         </w:tc>
       </w:tr>
       <w:tr>
-        <w:tblPrEx>
-          <w:tblCellMar>
-            <w:top w:w="0" w:type="dxa"/>
-            <w:bottom w:w="0" w:type="dxa"/>
-          </w:tblCellMar>
-        </w:tblPrEx>
         <w:tc>
           <w:tcPr>
             <w:tcW w:w="720" w:type="dxa"/>
@@ -1298,7 +1324,39 @@
                 <w:sz w:val="20"/>
                 <w:szCs w:val="20"/>
               </w:rPr>
-              <w:t>Pandas: DataFrames, filtering, groupby, merge</w:t>
+              <w:t xml:space="preserve">Pandas: </w:t>
+            </w:r>
+            <w:proofErr w:type="spellStart"/>
+            <w:r>
+              <w:rPr>
+                <w:sz w:val="20"/>
+                <w:szCs w:val="20"/>
+              </w:rPr>
+              <w:t>DataFrames</w:t>
+            </w:r>
+            <w:proofErr w:type="spellEnd"/>
+            <w:r>
+              <w:rPr>
+                <w:sz w:val="20"/>
+                <w:szCs w:val="20"/>
+              </w:rPr>
+              <w:t xml:space="preserve">, filtering, </w:t>
+            </w:r>
+            <w:proofErr w:type="spellStart"/>
+            <w:r>
+              <w:rPr>
+                <w:sz w:val="20"/>
+                <w:szCs w:val="20"/>
+              </w:rPr>
+              <w:t>groupby</w:t>
+            </w:r>
+            <w:proofErr w:type="spellEnd"/>
+            <w:r>
+              <w:rPr>
+                <w:sz w:val="20"/>
+                <w:szCs w:val="20"/>
+              </w:rPr>
+              <w:t>, merge</w:t>
             </w:r>
           </w:p>
           <w:p>
@@ -1319,12 +1377,6 @@
         </w:tc>
       </w:tr>
       <w:tr>
-        <w:tblPrEx>
-          <w:tblCellMar>
-            <w:top w:w="0" w:type="dxa"/>
-            <w:bottom w:w="0" w:type="dxa"/>
-          </w:tblCellMar>
-        </w:tblPrEx>
         <w:tc>
           <w:tcPr>
             <w:tcW w:w="720" w:type="dxa"/>
@@ -1424,12 +1476,6 @@
         <w:gridCol w:w="8640"/>
       </w:tblGrid>
       <w:tr>
-        <w:tblPrEx>
-          <w:tblCellMar>
-            <w:top w:w="0" w:type="dxa"/>
-            <w:bottom w:w="0" w:type="dxa"/>
-          </w:tblCellMar>
-        </w:tblPrEx>
         <w:tc>
           <w:tcPr>
             <w:tcW w:w="720" w:type="dxa"/>
@@ -1489,12 +1535,6 @@
         </w:tc>
       </w:tr>
       <w:tr>
-        <w:tblPrEx>
-          <w:tblCellMar>
-            <w:top w:w="0" w:type="dxa"/>
-            <w:bottom w:w="0" w:type="dxa"/>
-          </w:tblCellMar>
-        </w:tblPrEx>
         <w:tc>
           <w:tcPr>
             <w:tcW w:w="720" w:type="dxa"/>
@@ -1548,18 +1588,21 @@
                 <w:sz w:val="20"/>
                 <w:szCs w:val="20"/>
               </w:rPr>
-              <w:t>Data cleaning: missing values, outliers, dtypes</w:t>
-            </w:r>
+              <w:t xml:space="preserve">Data cleaning: missing values, outliers, </w:t>
+            </w:r>
+            <w:proofErr w:type="spellStart"/>
+            <w:r>
+              <w:rPr>
+                <w:sz w:val="20"/>
+                <w:szCs w:val="20"/>
+              </w:rPr>
+              <w:t>dtypes</w:t>
+            </w:r>
+            <w:proofErr w:type="spellEnd"/>
           </w:p>
         </w:tc>
       </w:tr>
       <w:tr>
-        <w:tblPrEx>
-          <w:tblCellMar>
-            <w:top w:w="0" w:type="dxa"/>
-            <w:bottom w:w="0" w:type="dxa"/>
-          </w:tblCellMar>
-        </w:tblPrEx>
         <w:tc>
           <w:tcPr>
             <w:tcW w:w="720" w:type="dxa"/>
@@ -1659,12 +1702,6 @@
         <w:gridCol w:w="8640"/>
       </w:tblGrid>
       <w:tr>
-        <w:tblPrEx>
-          <w:tblCellMar>
-            <w:top w:w="0" w:type="dxa"/>
-            <w:bottom w:w="0" w:type="dxa"/>
-          </w:tblCellMar>
-        </w:tblPrEx>
         <w:tc>
           <w:tcPr>
             <w:tcW w:w="720" w:type="dxa"/>
@@ -1739,12 +1776,6 @@
         </w:tc>
       </w:tr>
       <w:tr>
-        <w:tblPrEx>
-          <w:tblCellMar>
-            <w:top w:w="0" w:type="dxa"/>
-            <w:bottom w:w="0" w:type="dxa"/>
-          </w:tblCellMar>
-        </w:tblPrEx>
         <w:tc>
           <w:tcPr>
             <w:tcW w:w="720" w:type="dxa"/>
@@ -1804,12 +1835,6 @@
         </w:tc>
       </w:tr>
       <w:tr>
-        <w:tblPrEx>
-          <w:tblCellMar>
-            <w:top w:w="0" w:type="dxa"/>
-            <w:bottom w:w="0" w:type="dxa"/>
-          </w:tblCellMar>
-        </w:tblPrEx>
         <w:tc>
           <w:tcPr>
             <w:tcW w:w="720" w:type="dxa"/>
@@ -1909,12 +1934,6 @@
         <w:gridCol w:w="8640"/>
       </w:tblGrid>
       <w:tr>
-        <w:tblPrEx>
-          <w:tblCellMar>
-            <w:top w:w="0" w:type="dxa"/>
-            <w:bottom w:w="0" w:type="dxa"/>
-          </w:tblCellMar>
-        </w:tblPrEx>
         <w:tc>
           <w:tcPr>
             <w:tcW w:w="720" w:type="dxa"/>
@@ -1968,7 +1987,23 @@
                 <w:sz w:val="20"/>
                 <w:szCs w:val="20"/>
               </w:rPr>
-              <w:t>Intro to neural networks: perceptrons, activations, backprop (concepts)</w:t>
+              <w:t xml:space="preserve">Intro to neural networks: </w:t>
+            </w:r>
+            <w:proofErr w:type="spellStart"/>
+            <w:r>
+              <w:rPr>
+                <w:sz w:val="20"/>
+                <w:szCs w:val="20"/>
+              </w:rPr>
+              <w:t>perceptrons</w:t>
+            </w:r>
+            <w:proofErr w:type="spellEnd"/>
+            <w:r>
+              <w:rPr>
+                <w:sz w:val="20"/>
+                <w:szCs w:val="20"/>
+              </w:rPr>
+              <w:t>, activations, backprop (concepts)</w:t>
             </w:r>
           </w:p>
           <w:p>
@@ -1989,12 +2024,6 @@
         </w:tc>
       </w:tr>
       <w:tr>
-        <w:tblPrEx>
-          <w:tblCellMar>
-            <w:top w:w="0" w:type="dxa"/>
-            <w:bottom w:w="0" w:type="dxa"/>
-          </w:tblCellMar>
-        </w:tblPrEx>
         <w:tc>
           <w:tcPr>
             <w:tcW w:w="720" w:type="dxa"/>
@@ -2043,23 +2072,26 @@
             </w:tcMar>
           </w:tcPr>
           <w:p>
-            <w:r>
-              <w:rPr>
-                <w:sz w:val="20"/>
-                <w:szCs w:val="20"/>
-              </w:rPr>
-              <w:t>PyTorch or TensorFlow basics: tensors, layers, training loop</w:t>
+            <w:proofErr w:type="spellStart"/>
+            <w:r>
+              <w:rPr>
+                <w:sz w:val="20"/>
+                <w:szCs w:val="20"/>
+              </w:rPr>
+              <w:t>PyTorch</w:t>
+            </w:r>
+            <w:proofErr w:type="spellEnd"/>
+            <w:r>
+              <w:rPr>
+                <w:sz w:val="20"/>
+                <w:szCs w:val="20"/>
+              </w:rPr>
+              <w:t xml:space="preserve"> or TensorFlow basics: tensors, layers, training loop</w:t>
             </w:r>
           </w:p>
         </w:tc>
       </w:tr>
       <w:tr>
-        <w:tblPrEx>
-          <w:tblCellMar>
-            <w:top w:w="0" w:type="dxa"/>
-            <w:bottom w:w="0" w:type="dxa"/>
-          </w:tblCellMar>
-        </w:tblPrEx>
         <w:tc>
           <w:tcPr>
             <w:tcW w:w="720" w:type="dxa"/>
@@ -2139,7 +2171,29 @@
           <w:sz w:val="28"/>
           <w:szCs w:val="28"/>
         </w:rPr>
-        <w:t>Phase 3 — AI Development  (Weeks 9–12)</w:t>
+        <w:t xml:space="preserve">Phase 3 — AI </w:t>
+      </w:r>
+      <w:proofErr w:type="gramStart"/>
+      <w:r>
+        <w:rPr>
+          <w:b/>
+          <w:bCs/>
+          <w:color w:val="1A1A1A"/>
+          <w:sz w:val="28"/>
+          <w:szCs w:val="28"/>
+        </w:rPr>
+        <w:t>Development  (</w:t>
+      </w:r>
+      <w:proofErr w:type="gramEnd"/>
+      <w:r>
+        <w:rPr>
+          <w:b/>
+          <w:bCs/>
+          <w:color w:val="1A1A1A"/>
+          <w:sz w:val="28"/>
+          <w:szCs w:val="28"/>
+        </w:rPr>
+        <w:t>Weeks 9–12)</w:t>
       </w:r>
     </w:p>
     <w:p>
@@ -2177,12 +2231,6 @@
         <w:gridCol w:w="8640"/>
       </w:tblGrid>
       <w:tr>
-        <w:tblPrEx>
-          <w:tblCellMar>
-            <w:top w:w="0" w:type="dxa"/>
-            <w:bottom w:w="0" w:type="dxa"/>
-          </w:tblCellMar>
-        </w:tblPrEx>
         <w:tc>
           <w:tcPr>
             <w:tcW w:w="720" w:type="dxa"/>
@@ -2257,12 +2305,6 @@
         </w:tc>
       </w:tr>
       <w:tr>
-        <w:tblPrEx>
-          <w:tblCellMar>
-            <w:top w:w="0" w:type="dxa"/>
-            <w:bottom w:w="0" w:type="dxa"/>
-          </w:tblCellMar>
-        </w:tblPrEx>
         <w:tc>
           <w:tcPr>
             <w:tcW w:w="720" w:type="dxa"/>
@@ -2322,12 +2364,6 @@
         </w:tc>
       </w:tr>
       <w:tr>
-        <w:tblPrEx>
-          <w:tblCellMar>
-            <w:top w:w="0" w:type="dxa"/>
-            <w:bottom w:w="0" w:type="dxa"/>
-          </w:tblCellMar>
-        </w:tblPrEx>
         <w:tc>
           <w:tcPr>
             <w:tcW w:w="720" w:type="dxa"/>
@@ -2427,12 +2463,6 @@
         <w:gridCol w:w="8640"/>
       </w:tblGrid>
       <w:tr>
-        <w:tblPrEx>
-          <w:tblCellMar>
-            <w:top w:w="0" w:type="dxa"/>
-            <w:bottom w:w="0" w:type="dxa"/>
-          </w:tblCellMar>
-        </w:tblPrEx>
         <w:tc>
           <w:tcPr>
             <w:tcW w:w="720" w:type="dxa"/>
@@ -2481,12 +2511,37 @@
             </w:tcMar>
           </w:tcPr>
           <w:p>
-            <w:r>
-              <w:rPr>
-                <w:sz w:val="20"/>
-                <w:szCs w:val="20"/>
-              </w:rPr>
-              <w:t>LangChain or LlamaIndex basics: chains, agents, memory</w:t>
+            <w:proofErr w:type="spellStart"/>
+            <w:r>
+              <w:rPr>
+                <w:sz w:val="20"/>
+                <w:szCs w:val="20"/>
+              </w:rPr>
+              <w:t>LangChain</w:t>
+            </w:r>
+            <w:proofErr w:type="spellEnd"/>
+            <w:r>
+              <w:rPr>
+                <w:sz w:val="20"/>
+                <w:szCs w:val="20"/>
+              </w:rPr>
+              <w:t xml:space="preserve"> or </w:t>
+            </w:r>
+            <w:proofErr w:type="spellStart"/>
+            <w:r>
+              <w:rPr>
+                <w:sz w:val="20"/>
+                <w:szCs w:val="20"/>
+              </w:rPr>
+              <w:t>LlamaIndex</w:t>
+            </w:r>
+            <w:proofErr w:type="spellEnd"/>
+            <w:r>
+              <w:rPr>
+                <w:sz w:val="20"/>
+                <w:szCs w:val="20"/>
+              </w:rPr>
+              <w:t xml:space="preserve"> basics: chains, agents, memory</w:t>
             </w:r>
           </w:p>
           <w:p>
@@ -2501,18 +2556,34 @@
                 <w:sz w:val="18"/>
                 <w:szCs w:val="18"/>
               </w:rPr>
-              <w:t>Resource: LangChain docs</w:t>
+              <w:t xml:space="preserve">Resource: </w:t>
+            </w:r>
+            <w:proofErr w:type="spellStart"/>
+            <w:r>
+              <w:rPr>
+                <w:i/>
+                <w:iCs/>
+                <w:color w:val="1558B0"/>
+                <w:sz w:val="18"/>
+                <w:szCs w:val="18"/>
+              </w:rPr>
+              <w:t>LangChain</w:t>
+            </w:r>
+            <w:proofErr w:type="spellEnd"/>
+            <w:r>
+              <w:rPr>
+                <w:i/>
+                <w:iCs/>
+                <w:color w:val="1558B0"/>
+                <w:sz w:val="18"/>
+                <w:szCs w:val="18"/>
+              </w:rPr>
+              <w:t xml:space="preserve"> docs</w:t>
             </w:r>
           </w:p>
         </w:tc>
       </w:tr>
       <w:tr>
-        <w:tblPrEx>
-          <w:tblCellMar>
-            <w:top w:w="0" w:type="dxa"/>
-            <w:bottom w:w="0" w:type="dxa"/>
-          </w:tblCellMar>
-        </w:tblPrEx>
         <w:tc>
           <w:tcPr>
             <w:tcW w:w="720" w:type="dxa"/>
@@ -2572,12 +2643,6 @@
         </w:tc>
       </w:tr>
       <w:tr>
-        <w:tblPrEx>
-          <w:tblCellMar>
-            <w:top w:w="0" w:type="dxa"/>
-            <w:bottom w:w="0" w:type="dxa"/>
-          </w:tblCellMar>
-        </w:tblPrEx>
         <w:tc>
           <w:tcPr>
             <w:tcW w:w="720" w:type="dxa"/>
@@ -2678,12 +2743,6 @@
         <w:gridCol w:w="8640"/>
       </w:tblGrid>
       <w:tr>
-        <w:tblPrEx>
-          <w:tblCellMar>
-            <w:top w:w="0" w:type="dxa"/>
-            <w:bottom w:w="0" w:type="dxa"/>
-          </w:tblCellMar>
-        </w:tblPrEx>
         <w:tc>
           <w:tcPr>
             <w:tcW w:w="720" w:type="dxa"/>
@@ -2752,18 +2811,34 @@
                 <w:sz w:val="18"/>
                 <w:szCs w:val="18"/>
               </w:rPr>
-              <w:t>Resource: HuggingFace course</w:t>
+              <w:t xml:space="preserve">Resource: </w:t>
+            </w:r>
+            <w:proofErr w:type="spellStart"/>
+            <w:r>
+              <w:rPr>
+                <w:i/>
+                <w:iCs/>
+                <w:color w:val="1558B0"/>
+                <w:sz w:val="18"/>
+                <w:szCs w:val="18"/>
+              </w:rPr>
+              <w:t>HuggingFace</w:t>
+            </w:r>
+            <w:proofErr w:type="spellEnd"/>
+            <w:r>
+              <w:rPr>
+                <w:i/>
+                <w:iCs/>
+                <w:color w:val="1558B0"/>
+                <w:sz w:val="18"/>
+                <w:szCs w:val="18"/>
+              </w:rPr>
+              <w:t xml:space="preserve"> course</w:t>
             </w:r>
           </w:p>
         </w:tc>
       </w:tr>
       <w:tr>
-        <w:tblPrEx>
-          <w:tblCellMar>
-            <w:top w:w="0" w:type="dxa"/>
-            <w:bottom w:w="0" w:type="dxa"/>
-          </w:tblCellMar>
-        </w:tblPrEx>
         <w:tc>
           <w:tcPr>
             <w:tcW w:w="720" w:type="dxa"/>
@@ -2823,12 +2898,6 @@
         </w:tc>
       </w:tr>
       <w:tr>
-        <w:tblPrEx>
-          <w:tblCellMar>
-            <w:top w:w="0" w:type="dxa"/>
-            <w:bottom w:w="0" w:type="dxa"/>
-          </w:tblCellMar>
-        </w:tblPrEx>
         <w:tc>
           <w:tcPr>
             <w:tcW w:w="720" w:type="dxa"/>
@@ -2882,7 +2951,39 @@
                 <w:sz w:val="20"/>
                 <w:szCs w:val="20"/>
               </w:rPr>
-              <w:t>Explore Gradio or Streamlit to add a simple UI to your app</w:t>
+              <w:t xml:space="preserve">Explore </w:t>
+            </w:r>
+            <w:proofErr w:type="spellStart"/>
+            <w:r>
+              <w:rPr>
+                <w:sz w:val="20"/>
+                <w:szCs w:val="20"/>
+              </w:rPr>
+              <w:t>Gradio</w:t>
+            </w:r>
+            <w:proofErr w:type="spellEnd"/>
+            <w:r>
+              <w:rPr>
+                <w:sz w:val="20"/>
+                <w:szCs w:val="20"/>
+              </w:rPr>
+              <w:t xml:space="preserve"> or </w:t>
+            </w:r>
+            <w:proofErr w:type="spellStart"/>
+            <w:r>
+              <w:rPr>
+                <w:sz w:val="20"/>
+                <w:szCs w:val="20"/>
+              </w:rPr>
+              <w:t>Streamlit</w:t>
+            </w:r>
+            <w:proofErr w:type="spellEnd"/>
+            <w:r>
+              <w:rPr>
+                <w:sz w:val="20"/>
+                <w:szCs w:val="20"/>
+              </w:rPr>
+              <w:t xml:space="preserve"> to add a simple UI to your app</w:t>
             </w:r>
           </w:p>
         </w:tc>
@@ -2928,12 +3029,6 @@
         <w:gridCol w:w="8640"/>
       </w:tblGrid>
       <w:tr>
-        <w:tblPrEx>
-          <w:tblCellMar>
-            <w:top w:w="0" w:type="dxa"/>
-            <w:bottom w:w="0" w:type="dxa"/>
-          </w:tblCellMar>
-        </w:tblPrEx>
         <w:tc>
           <w:tcPr>
             <w:tcW w:w="720" w:type="dxa"/>
@@ -2993,12 +3088,6 @@
         </w:tc>
       </w:tr>
       <w:tr>
-        <w:tblPrEx>
-          <w:tblCellMar>
-            <w:top w:w="0" w:type="dxa"/>
-            <w:bottom w:w="0" w:type="dxa"/>
-          </w:tblCellMar>
-        </w:tblPrEx>
         <w:tc>
           <w:tcPr>
             <w:tcW w:w="720" w:type="dxa"/>
@@ -3058,12 +3147,6 @@
         </w:tc>
       </w:tr>
       <w:tr>
-        <w:tblPrEx>
-          <w:tblCellMar>
-            <w:top w:w="0" w:type="dxa"/>
-            <w:bottom w:w="0" w:type="dxa"/>
-          </w:tblCellMar>
-        </w:tblPrEx>
         <w:tc>
           <w:tcPr>
             <w:tcW w:w="720" w:type="dxa"/>

</xml_diff>

<commit_message>
practice code for list in python
</commit_message>
<xml_diff>
--- a/AI Projects/Python_AI_Study_Plan.docx
+++ b/AI Projects/Python_AI_Study_Plan.docx
@@ -687,8 +687,8 @@
         <w:tblLook w:val="0000" w:firstRow="0" w:lastRow="0" w:firstColumn="0" w:lastColumn="0" w:noHBand="0" w:noVBand="0"/>
       </w:tblPr>
       <w:tblGrid>
-        <w:gridCol w:w="720"/>
-        <w:gridCol w:w="8640"/>
+        <w:gridCol w:w="740"/>
+        <w:gridCol w:w="8620"/>
       </w:tblGrid>
       <w:tr>
         <w:tc>
@@ -790,10 +790,13 @@
             </w:pPr>
             <w:r>
               <w:rPr>
-                <w:sz w:val="20"/>
-                <w:szCs w:val="20"/>
-              </w:rPr>
-              <w:t>☐</w:t>
+                <w:b/>
+                <w:bCs/>
+                <w:color w:val="00B050"/>
+                <w:sz w:val="20"/>
+                <w:szCs w:val="20"/>
+              </w:rPr>
+              <w:t>Done</w:t>
             </w:r>
           </w:p>
         </w:tc>

</xml_diff>